<commit_message>
A fix to make the table header white in rendered docx file
</commit_message>
<xml_diff>
--- a/inst/quarto/_extensions/word-report/report_template2.docx
+++ b/inst/quarto/_extensions/word-report/report_template2.docx
@@ -2087,7 +2087,7 @@
   <w:docDefaults>
     <w:rPrDefault>
       <w:rPr>
-        <w:rFonts w:asciiTheme="minorHAnsi" w:eastAsiaTheme="minorHAnsi" w:hAnsiTheme="minorHAnsi" w:cstheme="minorBidi"/>
+        <w:rFonts w:asciiTheme="minorHAnsi" w:hAnsiTheme="minorHAnsi" w:eastAsiaTheme="minorHAnsi" w:cstheme="minorBidi"/>
         <w:sz w:val="22"/>
         <w:szCs w:val="22"/>
         <w:lang w:val="en-US" w:eastAsia="en-US" w:bidi="ar-SA"/>
@@ -2104,9 +2104,9 @@
     <w:lsdException w:name="index 7" w:semiHidden="1" w:unhideWhenUsed="1"/>
     <w:lsdException w:name="index 8" w:semiHidden="1" w:unhideWhenUsed="1"/>
     <w:lsdException w:name="index 9" w:semiHidden="1" w:unhideWhenUsed="1"/>
-    <w:lsdException w:name="toc 1" w:semiHidden="1" w:uiPriority="39" w:unhideWhenUsed="1"/>
-    <w:lsdException w:name="toc 2" w:semiHidden="1" w:uiPriority="39" w:unhideWhenUsed="1"/>
-    <w:lsdException w:name="toc 3" w:semiHidden="1" w:uiPriority="39" w:unhideWhenUsed="1"/>
+    <w:lsdException w:name="toc 1" w:uiPriority="39" w:semiHidden="1" w:unhideWhenUsed="1"/>
+    <w:lsdException w:name="toc 2" w:uiPriority="39" w:semiHidden="1" w:unhideWhenUsed="1"/>
+    <w:lsdException w:name="toc 3" w:uiPriority="39" w:semiHidden="1" w:unhideWhenUsed="1"/>
     <w:lsdException w:name="toc 4" w:semiHidden="1" w:unhideWhenUsed="1"/>
     <w:lsdException w:name="toc 5" w:semiHidden="1" w:unhideWhenUsed="1"/>
     <w:lsdException w:name="toc 6" w:semiHidden="1" w:unhideWhenUsed="1"/>
@@ -2332,7 +2332,7 @@
     <w:lsdException w:name="Colorful List Accent 6"/>
     <w:lsdException w:name="Colorful Grid Accent 6"/>
     <w:lsdException w:name="Bibliography" w:semiHidden="1" w:unhideWhenUsed="1"/>
-    <w:lsdException w:name="TOC Heading" w:semiHidden="1" w:uiPriority="39" w:unhideWhenUsed="1" w:qFormat="1"/>
+    <w:lsdException w:name="TOC Heading" w:uiPriority="39" w:semiHidden="1" w:unhideWhenUsed="1" w:qFormat="1"/>
     <w:lsdException w:name="Grid Table 4" w:uiPriority="49"/>
     <w:lsdException w:name="Grid Table 5 Dark" w:uiPriority="50"/>
     <w:lsdException w:name="Grid Table 6 Colorful" w:uiPriority="51"/>
@@ -2429,7 +2429,7 @@
     <w:lsdException w:name="List Table 6 Colorful Accent 6" w:uiPriority="51"/>
     <w:lsdException w:name="List Table 7 Colorful Accent 6" w:uiPriority="52"/>
   </w:latentStyles>
-  <w:style w:type="paragraph" w:default="1" w:styleId="Normal">
+  <w:style w:type="paragraph" w:styleId="Normal" w:default="1">
     <w:name w:val="Normal"/>
     <w:qFormat/>
     <w:rsid w:val="00594760"/>
@@ -2438,7 +2438,7 @@
       <w:jc w:val="both"/>
     </w:pPr>
     <w:rPr>
-      <w:color w:val="000000" w:themeColor="text1"/>
+      <w:color w:val="000000"/>
     </w:rPr>
   </w:style>
   <w:style w:type="paragraph" w:styleId="Heading1">
@@ -2559,7 +2559,7 @@
       <w:outlineLvl w:val="4"/>
     </w:pPr>
     <w:rPr>
-      <w:rFonts w:asciiTheme="majorHAnsi" w:eastAsiaTheme="majorEastAsia" w:hAnsiTheme="majorHAnsi" w:cstheme="majorBidi"/>
+      <w:rFonts w:asciiTheme="majorHAnsi" w:hAnsiTheme="majorHAnsi" w:eastAsiaTheme="majorEastAsia" w:cstheme="majorBidi"/>
       <w:iCs/>
       <w:color w:val="432CA1" w:themeColor="accent1"/>
     </w:rPr>
@@ -2578,7 +2578,7 @@
       <w:outlineLvl w:val="5"/>
     </w:pPr>
     <w:rPr>
-      <w:rFonts w:asciiTheme="majorHAnsi" w:eastAsiaTheme="majorEastAsia" w:hAnsiTheme="majorHAnsi" w:cstheme="majorBidi"/>
+      <w:rFonts w:asciiTheme="majorHAnsi" w:hAnsiTheme="majorHAnsi" w:eastAsiaTheme="majorEastAsia" w:cstheme="majorBidi"/>
       <w:color w:val="432CA1" w:themeColor="accent1"/>
     </w:rPr>
   </w:style>
@@ -2596,7 +2596,7 @@
       <w:outlineLvl w:val="6"/>
     </w:pPr>
     <w:rPr>
-      <w:rFonts w:asciiTheme="majorHAnsi" w:eastAsiaTheme="majorEastAsia" w:hAnsiTheme="majorHAnsi" w:cstheme="majorBidi"/>
+      <w:rFonts w:asciiTheme="majorHAnsi" w:hAnsiTheme="majorHAnsi" w:eastAsiaTheme="majorEastAsia" w:cstheme="majorBidi"/>
       <w:color w:val="432CA1" w:themeColor="accent1"/>
     </w:rPr>
   </w:style>
@@ -2614,7 +2614,7 @@
       <w:outlineLvl w:val="7"/>
     </w:pPr>
     <w:rPr>
-      <w:rFonts w:asciiTheme="majorHAnsi" w:eastAsiaTheme="majorEastAsia" w:hAnsiTheme="majorHAnsi" w:cstheme="majorBidi"/>
+      <w:rFonts w:asciiTheme="majorHAnsi" w:hAnsiTheme="majorHAnsi" w:eastAsiaTheme="majorEastAsia" w:cstheme="majorBidi"/>
       <w:color w:val="432CA1" w:themeColor="accent1"/>
     </w:rPr>
   </w:style>
@@ -2632,17 +2632,17 @@
       <w:outlineLvl w:val="8"/>
     </w:pPr>
     <w:rPr>
-      <w:rFonts w:asciiTheme="majorHAnsi" w:eastAsiaTheme="majorEastAsia" w:hAnsiTheme="majorHAnsi" w:cstheme="majorBidi"/>
+      <w:rFonts w:asciiTheme="majorHAnsi" w:hAnsiTheme="majorHAnsi" w:eastAsiaTheme="majorEastAsia" w:cstheme="majorBidi"/>
       <w:color w:val="432CA1" w:themeColor="accent1"/>
     </w:rPr>
   </w:style>
-  <w:style w:type="character" w:default="1" w:styleId="DefaultParagraphFont">
+  <w:style w:type="character" w:styleId="DefaultParagraphFont" w:default="1">
     <w:name w:val="Default Paragraph Font"/>
     <w:uiPriority w:val="1"/>
     <w:semiHidden/>
     <w:unhideWhenUsed/>
   </w:style>
-  <w:style w:type="table" w:default="1" w:styleId="TableNormal">
+  <w:style w:type="table" w:styleId="TableNormal" w:default="1">
     <w:name w:val="Normal Table"/>
     <w:uiPriority w:val="99"/>
     <w:semiHidden/>
@@ -2657,7 +2657,7 @@
       </w:tblCellMar>
     </w:tblPr>
   </w:style>
-  <w:style w:type="numbering" w:default="1" w:styleId="NoList">
+  <w:style w:type="numbering" w:styleId="NoList" w:default="1">
     <w:name w:val="No List"/>
     <w:uiPriority w:val="99"/>
     <w:semiHidden/>
@@ -2680,7 +2680,7 @@
       <w:lang w:val="en-GB"/>
     </w:rPr>
   </w:style>
-  <w:style w:type="paragraph" w:customStyle="1" w:styleId="FirstParagraph">
+  <w:style w:type="paragraph" w:styleId="FirstParagraph" w:customStyle="1">
     <w:name w:val="First Paragraph"/>
     <w:basedOn w:val="Normal"/>
     <w:next w:val="BodyText"/>
@@ -2697,7 +2697,7 @@
       <w:lang w:val="en-GB"/>
     </w:rPr>
   </w:style>
-  <w:style w:type="paragraph" w:customStyle="1" w:styleId="Compact">
+  <w:style w:type="paragraph" w:styleId="Compact" w:customStyle="1">
     <w:name w:val="Compact"/>
     <w:basedOn w:val="BodyText"/>
     <w:qFormat/>
@@ -2746,7 +2746,7 @@
       <w:lang w:val="en-GB"/>
     </w:rPr>
   </w:style>
-  <w:style w:type="paragraph" w:customStyle="1" w:styleId="Author">
+  <w:style w:type="paragraph" w:styleId="Author" w:customStyle="1">
     <w:name w:val="Author"/>
     <w:basedOn w:val="Normal"/>
     <w:next w:val="BodyText"/>
@@ -2782,7 +2782,7 @@
       <w:jc w:val="left"/>
     </w:pPr>
   </w:style>
-  <w:style w:type="paragraph" w:customStyle="1" w:styleId="Abstract">
+  <w:style w:type="paragraph" w:styleId="Abstract" w:customStyle="1">
     <w:name w:val="Abstract"/>
     <w:basedOn w:val="Normal"/>
     <w:next w:val="BodyText"/>
@@ -2831,7 +2831,7 @@
       <w:szCs w:val="20"/>
     </w:rPr>
   </w:style>
-  <w:style w:type="table" w:customStyle="1" w:styleId="Table">
+  <w:style w:type="table" w:styleId="Table" w:customStyle="1">
     <w:name w:val="Table"/>
     <w:semiHidden/>
     <w:unhideWhenUsed/>
@@ -2840,11 +2840,11 @@
     <w:tblPr>
       <w:tblInd w:w="0" w:type="dxa"/>
       <w:tblBorders>
-        <w:top w:val="single" w:sz="4" w:space="0" w:color="432CA1" w:themeColor="accent1"/>
-        <w:left w:val="single" w:sz="4" w:space="0" w:color="432CA1" w:themeColor="accent1"/>
-        <w:bottom w:val="single" w:sz="4" w:space="0" w:color="432CA1" w:themeColor="accent1"/>
-        <w:right w:val="single" w:sz="4" w:space="0" w:color="432CA1" w:themeColor="accent1"/>
-        <w:insideH w:val="single" w:sz="4" w:space="0" w:color="432CA1" w:themeColor="accent1"/>
+        <w:top w:val="single" w:color="432CA1" w:themeColor="accent1" w:sz="4" w:space="0"/>
+        <w:left w:val="single" w:color="432CA1" w:themeColor="accent1" w:sz="4" w:space="0"/>
+        <w:bottom w:val="single" w:color="432CA1" w:themeColor="accent1" w:sz="4" w:space="0"/>
+        <w:right w:val="single" w:color="432CA1" w:themeColor="accent1" w:sz="4" w:space="0"/>
+        <w:insideH w:val="single" w:color="432CA1" w:themeColor="accent1" w:sz="4" w:space="0"/>
       </w:tblBorders>
       <w:tblCellMar>
         <w:top w:w="0" w:type="dxa"/>
@@ -2865,7 +2865,7 @@
       </w:tcPr>
     </w:tblStylePr>
   </w:style>
-  <w:style w:type="paragraph" w:customStyle="1" w:styleId="DefinitionTerm">
+  <w:style w:type="paragraph" w:styleId="DefinitionTerm" w:customStyle="1">
     <w:name w:val="Definition Term"/>
     <w:basedOn w:val="Normal"/>
     <w:next w:val="Definition"/>
@@ -2878,7 +2878,7 @@
       <w:b/>
     </w:rPr>
   </w:style>
-  <w:style w:type="paragraph" w:customStyle="1" w:styleId="Definition">
+  <w:style w:type="paragraph" w:styleId="Definition" w:customStyle="1">
     <w:name w:val="Definition"/>
     <w:basedOn w:val="Normal"/>
   </w:style>
@@ -2904,34 +2904,34 @@
       <w:lang w:val="en-GB" w:eastAsia="de-DE"/>
     </w:rPr>
   </w:style>
-  <w:style w:type="paragraph" w:customStyle="1" w:styleId="TableCaption">
+  <w:style w:type="paragraph" w:styleId="TableCaption" w:customStyle="1">
     <w:name w:val="Table Caption"/>
     <w:basedOn w:val="Caption"/>
     <w:pPr>
       <w:keepNext/>
     </w:pPr>
   </w:style>
-  <w:style w:type="paragraph" w:customStyle="1" w:styleId="ImageCaption">
+  <w:style w:type="paragraph" w:styleId="ImageCaption" w:customStyle="1">
     <w:name w:val="Image Caption"/>
     <w:basedOn w:val="Caption"/>
   </w:style>
-  <w:style w:type="paragraph" w:customStyle="1" w:styleId="Figure">
+  <w:style w:type="paragraph" w:styleId="Figure" w:customStyle="1">
     <w:name w:val="Figure"/>
     <w:basedOn w:val="Normal"/>
   </w:style>
-  <w:style w:type="paragraph" w:customStyle="1" w:styleId="CaptionedFigure">
+  <w:style w:type="paragraph" w:styleId="CaptionedFigure" w:customStyle="1">
     <w:name w:val="Captioned Figure"/>
     <w:basedOn w:val="Figure"/>
     <w:pPr>
       <w:keepNext/>
     </w:pPr>
   </w:style>
-  <w:style w:type="character" w:customStyle="1" w:styleId="CaptionChar">
+  <w:style w:type="character" w:styleId="CaptionChar" w:customStyle="1">
     <w:name w:val="Caption Char"/>
     <w:basedOn w:val="DefaultParagraphFont"/>
     <w:link w:val="Caption"/>
   </w:style>
-  <w:style w:type="character" w:customStyle="1" w:styleId="VerbatimChar">
+  <w:style w:type="character" w:styleId="VerbatimChar" w:customStyle="1">
     <w:name w:val="Verbatim Char"/>
     <w:basedOn w:val="CaptionChar"/>
     <w:link w:val="SourceCode"/>
@@ -2940,7 +2940,7 @@
       <w:sz w:val="22"/>
     </w:rPr>
   </w:style>
-  <w:style w:type="character" w:customStyle="1" w:styleId="SectionNumber">
+  <w:style w:type="character" w:styleId="SectionNumber" w:customStyle="1">
     <w:name w:val="Section Number"/>
     <w:basedOn w:val="CaptionChar"/>
   </w:style>
@@ -2969,7 +2969,7 @@
     <w:qFormat/>
     <w:rsid w:val="00156562"/>
   </w:style>
-  <w:style w:type="paragraph" w:customStyle="1" w:styleId="SourceCode">
+  <w:style w:type="paragraph" w:styleId="SourceCode" w:customStyle="1">
     <w:name w:val="Source Code"/>
     <w:basedOn w:val="Normal"/>
     <w:link w:val="VerbatimChar"/>
@@ -2978,7 +2978,7 @@
       <w:wordWrap w:val="0"/>
     </w:pPr>
   </w:style>
-  <w:style w:type="character" w:customStyle="1" w:styleId="KeywordTok">
+  <w:style w:type="character" w:styleId="KeywordTok" w:customStyle="1">
     <w:name w:val="KeywordTok"/>
     <w:basedOn w:val="VerbatimChar"/>
     <w:rPr>
@@ -2988,7 +2988,7 @@
       <w:shd w:val="clear" w:color="auto" w:fill="F1F3F5"/>
     </w:rPr>
   </w:style>
-  <w:style w:type="character" w:customStyle="1" w:styleId="DataTypeTok">
+  <w:style w:type="character" w:styleId="DataTypeTok" w:customStyle="1">
     <w:name w:val="DataTypeTok"/>
     <w:basedOn w:val="VerbatimChar"/>
     <w:rPr>
@@ -2998,7 +2998,7 @@
       <w:shd w:val="clear" w:color="auto" w:fill="F1F3F5"/>
     </w:rPr>
   </w:style>
-  <w:style w:type="character" w:customStyle="1" w:styleId="DecValTok">
+  <w:style w:type="character" w:styleId="DecValTok" w:customStyle="1">
     <w:name w:val="DecValTok"/>
     <w:basedOn w:val="VerbatimChar"/>
     <w:rPr>
@@ -3008,7 +3008,7 @@
       <w:shd w:val="clear" w:color="auto" w:fill="F1F3F5"/>
     </w:rPr>
   </w:style>
-  <w:style w:type="character" w:customStyle="1" w:styleId="BaseNTok">
+  <w:style w:type="character" w:styleId="BaseNTok" w:customStyle="1">
     <w:name w:val="BaseNTok"/>
     <w:basedOn w:val="VerbatimChar"/>
     <w:rPr>
@@ -3018,7 +3018,7 @@
       <w:shd w:val="clear" w:color="auto" w:fill="F1F3F5"/>
     </w:rPr>
   </w:style>
-  <w:style w:type="character" w:customStyle="1" w:styleId="FloatTok">
+  <w:style w:type="character" w:styleId="FloatTok" w:customStyle="1">
     <w:name w:val="FloatTok"/>
     <w:basedOn w:val="VerbatimChar"/>
     <w:rPr>
@@ -3028,7 +3028,7 @@
       <w:shd w:val="clear" w:color="auto" w:fill="F1F3F5"/>
     </w:rPr>
   </w:style>
-  <w:style w:type="character" w:customStyle="1" w:styleId="ConstantTok">
+  <w:style w:type="character" w:styleId="ConstantTok" w:customStyle="1">
     <w:name w:val="ConstantTok"/>
     <w:basedOn w:val="VerbatimChar"/>
     <w:rPr>
@@ -3038,7 +3038,7 @@
       <w:shd w:val="clear" w:color="auto" w:fill="F1F3F5"/>
     </w:rPr>
   </w:style>
-  <w:style w:type="character" w:customStyle="1" w:styleId="CharTok">
+  <w:style w:type="character" w:styleId="CharTok" w:customStyle="1">
     <w:name w:val="CharTok"/>
     <w:basedOn w:val="VerbatimChar"/>
     <w:rPr>
@@ -3048,7 +3048,7 @@
       <w:shd w:val="clear" w:color="auto" w:fill="F1F3F5"/>
     </w:rPr>
   </w:style>
-  <w:style w:type="character" w:customStyle="1" w:styleId="SpecialCharTok">
+  <w:style w:type="character" w:styleId="SpecialCharTok" w:customStyle="1">
     <w:name w:val="SpecialCharTok"/>
     <w:basedOn w:val="VerbatimChar"/>
     <w:rPr>
@@ -3058,7 +3058,7 @@
       <w:shd w:val="clear" w:color="auto" w:fill="F1F3F5"/>
     </w:rPr>
   </w:style>
-  <w:style w:type="character" w:customStyle="1" w:styleId="StringTok">
+  <w:style w:type="character" w:styleId="StringTok" w:customStyle="1">
     <w:name w:val="StringTok"/>
     <w:basedOn w:val="VerbatimChar"/>
     <w:rPr>
@@ -3068,7 +3068,7 @@
       <w:shd w:val="clear" w:color="auto" w:fill="F1F3F5"/>
     </w:rPr>
   </w:style>
-  <w:style w:type="character" w:customStyle="1" w:styleId="VerbatimStringTok">
+  <w:style w:type="character" w:styleId="VerbatimStringTok" w:customStyle="1">
     <w:name w:val="VerbatimStringTok"/>
     <w:basedOn w:val="VerbatimChar"/>
     <w:rPr>
@@ -3078,7 +3078,7 @@
       <w:shd w:val="clear" w:color="auto" w:fill="F1F3F5"/>
     </w:rPr>
   </w:style>
-  <w:style w:type="character" w:customStyle="1" w:styleId="SpecialStringTok">
+  <w:style w:type="character" w:styleId="SpecialStringTok" w:customStyle="1">
     <w:name w:val="SpecialStringTok"/>
     <w:basedOn w:val="VerbatimChar"/>
     <w:rPr>
@@ -3088,7 +3088,7 @@
       <w:shd w:val="clear" w:color="auto" w:fill="F1F3F5"/>
     </w:rPr>
   </w:style>
-  <w:style w:type="character" w:customStyle="1" w:styleId="ImportTok">
+  <w:style w:type="character" w:styleId="ImportTok" w:customStyle="1">
     <w:name w:val="ImportTok"/>
     <w:basedOn w:val="VerbatimChar"/>
     <w:rPr>
@@ -3098,7 +3098,7 @@
       <w:shd w:val="clear" w:color="auto" w:fill="F1F3F5"/>
     </w:rPr>
   </w:style>
-  <w:style w:type="character" w:customStyle="1" w:styleId="CommentTok">
+  <w:style w:type="character" w:styleId="CommentTok" w:customStyle="1">
     <w:name w:val="CommentTok"/>
     <w:basedOn w:val="VerbatimChar"/>
     <w:rPr>
@@ -3108,7 +3108,7 @@
       <w:shd w:val="clear" w:color="auto" w:fill="F1F3F5"/>
     </w:rPr>
   </w:style>
-  <w:style w:type="character" w:customStyle="1" w:styleId="DocumentationTok">
+  <w:style w:type="character" w:styleId="DocumentationTok" w:customStyle="1">
     <w:name w:val="DocumentationTok"/>
     <w:basedOn w:val="VerbatimChar"/>
     <w:rPr>
@@ -3119,7 +3119,7 @@
       <w:shd w:val="clear" w:color="auto" w:fill="F1F3F5"/>
     </w:rPr>
   </w:style>
-  <w:style w:type="character" w:customStyle="1" w:styleId="AnnotationTok">
+  <w:style w:type="character" w:styleId="AnnotationTok" w:customStyle="1">
     <w:name w:val="AnnotationTok"/>
     <w:basedOn w:val="VerbatimChar"/>
     <w:rPr>
@@ -3129,7 +3129,7 @@
       <w:shd w:val="clear" w:color="auto" w:fill="F1F3F5"/>
     </w:rPr>
   </w:style>
-  <w:style w:type="character" w:customStyle="1" w:styleId="CommentVarTok">
+  <w:style w:type="character" w:styleId="CommentVarTok" w:customStyle="1">
     <w:name w:val="CommentVarTok"/>
     <w:basedOn w:val="VerbatimChar"/>
     <w:rPr>
@@ -3140,7 +3140,7 @@
       <w:shd w:val="clear" w:color="auto" w:fill="F1F3F5"/>
     </w:rPr>
   </w:style>
-  <w:style w:type="character" w:customStyle="1" w:styleId="OtherTok">
+  <w:style w:type="character" w:styleId="OtherTok" w:customStyle="1">
     <w:name w:val="OtherTok"/>
     <w:basedOn w:val="VerbatimChar"/>
     <w:rPr>
@@ -3150,7 +3150,7 @@
       <w:shd w:val="clear" w:color="auto" w:fill="F1F3F5"/>
     </w:rPr>
   </w:style>
-  <w:style w:type="character" w:customStyle="1" w:styleId="FunctionTok">
+  <w:style w:type="character" w:styleId="FunctionTok" w:customStyle="1">
     <w:name w:val="FunctionTok"/>
     <w:basedOn w:val="VerbatimChar"/>
     <w:rPr>
@@ -3160,7 +3160,7 @@
       <w:shd w:val="clear" w:color="auto" w:fill="F1F3F5"/>
     </w:rPr>
   </w:style>
-  <w:style w:type="character" w:customStyle="1" w:styleId="VariableTok">
+  <w:style w:type="character" w:styleId="VariableTok" w:customStyle="1">
     <w:name w:val="VariableTok"/>
     <w:basedOn w:val="VerbatimChar"/>
     <w:rPr>
@@ -3170,7 +3170,7 @@
       <w:shd w:val="clear" w:color="auto" w:fill="F1F3F5"/>
     </w:rPr>
   </w:style>
-  <w:style w:type="character" w:customStyle="1" w:styleId="ControlFlowTok">
+  <w:style w:type="character" w:styleId="ControlFlowTok" w:customStyle="1">
     <w:name w:val="ControlFlowTok"/>
     <w:basedOn w:val="VerbatimChar"/>
     <w:rPr>
@@ -3180,7 +3180,7 @@
       <w:shd w:val="clear" w:color="auto" w:fill="F1F3F5"/>
     </w:rPr>
   </w:style>
-  <w:style w:type="character" w:customStyle="1" w:styleId="OperatorTok">
+  <w:style w:type="character" w:styleId="OperatorTok" w:customStyle="1">
     <w:name w:val="OperatorTok"/>
     <w:basedOn w:val="VerbatimChar"/>
     <w:rPr>
@@ -3190,7 +3190,7 @@
       <w:shd w:val="clear" w:color="auto" w:fill="F1F3F5"/>
     </w:rPr>
   </w:style>
-  <w:style w:type="character" w:customStyle="1" w:styleId="BuiltInTok">
+  <w:style w:type="character" w:styleId="BuiltInTok" w:customStyle="1">
     <w:name w:val="BuiltInTok"/>
     <w:basedOn w:val="VerbatimChar"/>
     <w:rPr>
@@ -3200,7 +3200,7 @@
       <w:shd w:val="clear" w:color="auto" w:fill="F1F3F5"/>
     </w:rPr>
   </w:style>
-  <w:style w:type="character" w:customStyle="1" w:styleId="ExtensionTok">
+  <w:style w:type="character" w:styleId="ExtensionTok" w:customStyle="1">
     <w:name w:val="ExtensionTok"/>
     <w:basedOn w:val="VerbatimChar"/>
     <w:rPr>
@@ -3210,7 +3210,7 @@
       <w:shd w:val="clear" w:color="auto" w:fill="F1F3F5"/>
     </w:rPr>
   </w:style>
-  <w:style w:type="character" w:customStyle="1" w:styleId="PreprocessorTok">
+  <w:style w:type="character" w:styleId="PreprocessorTok" w:customStyle="1">
     <w:name w:val="PreprocessorTok"/>
     <w:basedOn w:val="VerbatimChar"/>
     <w:rPr>
@@ -3220,7 +3220,7 @@
       <w:shd w:val="clear" w:color="auto" w:fill="F1F3F5"/>
     </w:rPr>
   </w:style>
-  <w:style w:type="character" w:customStyle="1" w:styleId="AttributeTok">
+  <w:style w:type="character" w:styleId="AttributeTok" w:customStyle="1">
     <w:name w:val="AttributeTok"/>
     <w:basedOn w:val="VerbatimChar"/>
     <w:rPr>
@@ -3230,7 +3230,7 @@
       <w:shd w:val="clear" w:color="auto" w:fill="F1F3F5"/>
     </w:rPr>
   </w:style>
-  <w:style w:type="character" w:customStyle="1" w:styleId="RegionMarkerTok">
+  <w:style w:type="character" w:styleId="RegionMarkerTok" w:customStyle="1">
     <w:name w:val="RegionMarkerTok"/>
     <w:basedOn w:val="VerbatimChar"/>
     <w:rPr>
@@ -3240,7 +3240,7 @@
       <w:shd w:val="clear" w:color="auto" w:fill="F1F3F5"/>
     </w:rPr>
   </w:style>
-  <w:style w:type="character" w:customStyle="1" w:styleId="InformationTok">
+  <w:style w:type="character" w:styleId="InformationTok" w:customStyle="1">
     <w:name w:val="InformationTok"/>
     <w:basedOn w:val="VerbatimChar"/>
     <w:rPr>
@@ -3250,7 +3250,7 @@
       <w:shd w:val="clear" w:color="auto" w:fill="F1F3F5"/>
     </w:rPr>
   </w:style>
-  <w:style w:type="character" w:customStyle="1" w:styleId="WarningTok">
+  <w:style w:type="character" w:styleId="WarningTok" w:customStyle="1">
     <w:name w:val="WarningTok"/>
     <w:basedOn w:val="VerbatimChar"/>
     <w:rPr>
@@ -3261,7 +3261,7 @@
       <w:shd w:val="clear" w:color="auto" w:fill="F1F3F5"/>
     </w:rPr>
   </w:style>
-  <w:style w:type="character" w:customStyle="1" w:styleId="AlertTok">
+  <w:style w:type="character" w:styleId="AlertTok" w:customStyle="1">
     <w:name w:val="AlertTok"/>
     <w:basedOn w:val="VerbatimChar"/>
     <w:rPr>
@@ -3271,7 +3271,7 @@
       <w:shd w:val="clear" w:color="auto" w:fill="F1F3F5"/>
     </w:rPr>
   </w:style>
-  <w:style w:type="character" w:customStyle="1" w:styleId="ErrorTok">
+  <w:style w:type="character" w:styleId="ErrorTok" w:customStyle="1">
     <w:name w:val="ErrorTok"/>
     <w:basedOn w:val="VerbatimChar"/>
     <w:rPr>
@@ -3281,7 +3281,7 @@
       <w:shd w:val="clear" w:color="auto" w:fill="F1F3F5"/>
     </w:rPr>
   </w:style>
-  <w:style w:type="character" w:customStyle="1" w:styleId="NormalTok">
+  <w:style w:type="character" w:styleId="NormalTok" w:customStyle="1">
     <w:name w:val="NormalTok"/>
     <w:basedOn w:val="VerbatimChar"/>
     <w:rPr>
@@ -3341,7 +3341,7 @@
       <w:ind w:left="1560" w:hanging="709"/>
     </w:pPr>
   </w:style>
-  <w:style w:type="character" w:customStyle="1" w:styleId="Heading1Char">
+  <w:style w:type="character" w:styleId="Heading1Char" w:customStyle="1">
     <w:name w:val="Heading 1 Char"/>
     <w:basedOn w:val="DefaultParagraphFont"/>
     <w:link w:val="Heading1"/>
@@ -3372,7 +3372,7 @@
       <w:spacing w:after="0" w:line="240" w:lineRule="auto"/>
     </w:pPr>
   </w:style>
-  <w:style w:type="character" w:customStyle="1" w:styleId="HeaderChar">
+  <w:style w:type="character" w:styleId="HeaderChar" w:customStyle="1">
     <w:name w:val="Header Char"/>
     <w:basedOn w:val="DefaultParagraphFont"/>
     <w:link w:val="Header"/>
@@ -3392,7 +3392,7 @@
       <w:spacing w:after="0" w:line="240" w:lineRule="auto"/>
     </w:pPr>
   </w:style>
-  <w:style w:type="character" w:customStyle="1" w:styleId="FooterChar">
+  <w:style w:type="character" w:styleId="FooterChar" w:customStyle="1">
     <w:name w:val="Footer Char"/>
     <w:basedOn w:val="DefaultParagraphFont"/>
     <w:link w:val="Footer"/>
@@ -3407,7 +3407,7 @@
       <w:color w:val="808080"/>
     </w:rPr>
   </w:style>
-  <w:style w:type="character" w:customStyle="1" w:styleId="BodyTextChar">
+  <w:style w:type="character" w:styleId="BodyTextChar" w:customStyle="1">
     <w:name w:val="Body Text Char"/>
     <w:basedOn w:val="DefaultParagraphFont"/>
     <w:link w:val="BodyText"/>
@@ -3418,6 +3418,14 @@
       <w:sz w:val="22"/>
       <w:szCs w:val="22"/>
       <w:lang w:val="en-GB"/>
+    </w:rPr>
+  </w:style>
+  <w:style xmlns:w="http://schemas.openxmlformats.org/wordprocessingml/2006/main" w:type="character" w:styleId="TableHeaderWhite" w:customStyle="1">
+    <w:name w:val="Table Header White"/>
+    <w:basedOn w:val="DefaultParagraphFont"/>
+    <w:rPr>
+      <w:b/>
+      <w:color w:val="FFFFFF"/>
     </w:rPr>
   </w:style>
 </w:styles>

</xml_diff>